<commit_message>
Correction erreur de titre
</commit_message>
<xml_diff>
--- a/Cours/6eme/SaintExupery/Chapitre_14_1/Documents/Chapitre 14 - Problèmes de valeurs inconnues (A trou).docx
+++ b/Cours/6eme/SaintExupery/Chapitre_14_1/Documents/Chapitre 14 - Problèmes de valeurs inconnues (A trou).docx
@@ -165,7 +165,10 @@
         <w:t xml:space="preserve"> – </w:t>
       </w:r>
       <w:r>
-        <w:t xml:space="preserve">Notation </w:t>
+        <w:t>Schéma</w:t>
+      </w:r>
+      <w:r>
+        <w:t xml:space="preserve"> </w:t>
       </w:r>
       <w:r>
         <w:t>:</w:t>
@@ -277,10 +280,7 @@
         <w:t>🍐</w:t>
       </w:r>
       <w:r>
-        <w:t xml:space="preserve"> =</w:t>
-      </w:r>
-      <w:r>
-        <w:t xml:space="preserve"> </w:t>
+        <w:t xml:space="preserve"> = </w:t>
       </w:r>
       <w:r>
         <w:rPr>
@@ -511,6 +511,9 @@
         </w:rPr>
       </w:pPr>
       <w:r>
+        <w:rPr>
+          <w:noProof/>
+        </w:rPr>
         <w:drawing>
           <wp:inline distT="0" distB="0" distL="0" distR="0" wp14:anchorId="609C10C7" wp14:editId="5E3C832C">
             <wp:extent cx="1550352" cy="1296000"/>
@@ -602,10 +605,7 @@
         <w:tab/>
       </w:r>
       <w:r>
-        <w:t xml:space="preserve"> </w:t>
-      </w:r>
-      <w:r>
-        <w:t xml:space="preserve">et </w:t>
+        <w:t xml:space="preserve"> et </w:t>
       </w:r>
       <w:r>
         <w:rPr>
@@ -668,10 +668,7 @@
         <w:t>️</w:t>
       </w:r>
       <w:r>
-        <w:t xml:space="preserve"> pèsent</w:t>
-      </w:r>
-      <w:r>
-        <w:t xml:space="preserve"> </w:t>
+        <w:t xml:space="preserve"> pèsent </w:t>
       </w:r>
       <w:r>
         <w:rPr>
@@ -733,13 +730,7 @@
         <w:tab/>
       </w:r>
       <w:r>
-        <w:t xml:space="preserve"> </w:t>
-      </w:r>
-      <w:r>
-        <w:t>soit</w:t>
-      </w:r>
-      <w:r>
-        <w:t xml:space="preserve"> </w:t>
+        <w:t xml:space="preserve"> soit </w:t>
       </w:r>
       <w:r>
         <w:rPr>
@@ -758,10 +749,7 @@
         </w:tabs>
       </w:pPr>
       <w:r>
-        <w:t>Un baril pèse donc</w:t>
-      </w:r>
-      <w:r>
-        <w:t xml:space="preserve"> </w:t>
+        <w:t xml:space="preserve">Un baril pèse donc </w:t>
       </w:r>
       <w:r>
         <w:rPr>
@@ -785,10 +773,7 @@
         </w:rPr>
       </w:pPr>
       <w:r>
-        <w:t>Un carton pèse donc</w:t>
-      </w:r>
-      <w:r>
-        <w:t xml:space="preserve"> </w:t>
+        <w:t xml:space="preserve">Un carton pèse donc </w:t>
       </w:r>
       <w:r>
         <w:rPr>
@@ -937,6 +922,9 @@
               <w:jc w:val="center"/>
             </w:pPr>
             <w:r>
+              <w:rPr>
+                <w:noProof/>
+              </w:rPr>
               <w:drawing>
                 <wp:inline distT="0" distB="0" distL="0" distR="0" wp14:anchorId="528129DE" wp14:editId="402FFF4B">
                   <wp:extent cx="685800" cy="685800"/>
@@ -991,6 +979,9 @@
               <w:jc w:val="center"/>
             </w:pPr>
             <w:r>
+              <w:rPr>
+                <w:noProof/>
+              </w:rPr>
               <w:drawing>
                 <wp:inline distT="0" distB="0" distL="0" distR="0" wp14:anchorId="0C61AB54" wp14:editId="19F66925">
                   <wp:extent cx="1266825" cy="685800"/>

</xml_diff>